<commit_message>
fix(slide8): update financial model values — J-curve, stress scenarios, market capture
- J-curve: smooth data points around M18, zero crossing at M21
- Milestones: Breakeven at M12, Payback at M21, M24 +$1.2M (was +$2.2M)
- 3-Year Capture: $46M → $36M
- Stress scenarios: Base M12/M20, Conservative M17/M32, Pessimistic M29/>M36
- Unit economics label: "Operating Breakeven" → "Breakeven"
- Slide 6 Phase 4 users: ~251K → ~235K
- Updated FinalSubmission docs and financial model

Co-Authored-By: Claude Opus 4.6 (1M context) <noreply@anthropic.com>
</commit_message>
<xml_diff>
--- a/FinalSubmission/Briefing Group7(updated).docx
+++ b/FinalSubmission/Briefing Group7(updated).docx
@@ -1643,6 +1643,36 @@
           <w:szCs w:val="20"/>
         </w:rPr>
         <w:t>.</w:t>
+      </w:r>
+      <w:r>
+        <w:rPr>
+          <w:rFonts w:ascii="Helvetica" w:hAnsi="Helvetica" w:cs="Arial"/>
+          <w:noProof/>
+          <w:color w:val="000000" w:themeColor="text1"/>
+          <w:sz w:val="20"/>
+          <w:szCs w:val="20"/>
+        </w:rPr>
+        <w:t xml:space="preserve"> (</w:t>
+      </w:r>
+      <w:r>
+        <w:rPr>
+          <w:rFonts w:ascii="Helvetica" w:hAnsi="Helvetica" w:cs="Arial"/>
+          <w:noProof/>
+          <w:color w:val="000000" w:themeColor="text1"/>
+          <w:sz w:val="20"/>
+          <w:szCs w:val="20"/>
+        </w:rPr>
+        <w:t>https://poseidon-mit.com</w:t>
+      </w:r>
+      <w:r>
+        <w:rPr>
+          <w:rFonts w:ascii="Helvetica" w:hAnsi="Helvetica" w:cs="Arial"/>
+          <w:noProof/>
+          <w:color w:val="000000" w:themeColor="text1"/>
+          <w:sz w:val="20"/>
+          <w:szCs w:val="20"/>
+        </w:rPr>
+        <w:t>)</w:t>
       </w:r>
     </w:p>
     <w:sectPr>
@@ -3287,35 +3317,6 @@
 </file>
 
 <file path=customXml/item1.xml><?xml version="1.0" encoding="utf-8"?>
-<?mso-contentType ?>
-<FormTemplates xmlns="http://schemas.microsoft.com/sharepoint/v3/contenttype/forms">
-  <Display>DocumentLibraryForm</Display>
-  <Edit>DocumentLibraryForm</Edit>
-  <New>DocumentLibraryForm</New>
-</FormTemplates>
-</file>
-
-<file path=customXml/item2.xml><?xml version="1.0" encoding="utf-8"?>
-<p:properties xmlns:p="http://schemas.microsoft.com/office/2006/metadata/properties" xmlns:xsi="http://www.w3.org/2001/XMLSchema-instance" xmlns:pc="http://schemas.microsoft.com/office/infopath/2007/PartnerControls">
-  <documentManagement>
-    <Asignar xmlns="8ca203b5-b588-4393-8bee-af94b6d67263">
-      <UserInfo>
-        <DisplayName/>
-        <AccountId xsi:nil="true"/>
-        <AccountType/>
-      </UserInfo>
-    </Asignar>
-    <TaxCatchAll xmlns="f1a041be-d0ea-4704-81f1-81fc8552e438" xsi:nil="true"/>
-    <lcf76f155ced4ddcb4097134ff3c332f xmlns="8ca203b5-b588-4393-8bee-af94b6d67263">
-      <Terms xmlns="http://schemas.microsoft.com/office/infopath/2007/PartnerControls"/>
-    </lcf76f155ced4ddcb4097134ff3c332f>
-    <_ip_UnifiedCompliancePolicyUIAction xmlns="http://schemas.microsoft.com/sharepoint/v3" xsi:nil="true"/>
-    <_ip_UnifiedCompliancePolicyProperties xmlns="http://schemas.microsoft.com/sharepoint/v3" xsi:nil="true"/>
-  </documentManagement>
-</p:properties>
-</file>
-
-<file path=customXml/item3.xml><?xml version="1.0" encoding="utf-8"?>
 <ct:contentTypeSchema xmlns:ct="http://schemas.microsoft.com/office/2006/metadata/contentType" xmlns:ma="http://schemas.microsoft.com/office/2006/metadata/properties/metaAttributes" ct:_="" ma:_="" ma:contentTypeName="Documento" ma:contentTypeID="0x010100908FDF0882031D4F8C9FB6B328DCFAD3" ma:contentTypeVersion="24" ma:contentTypeDescription="Crear nuevo documento." ma:contentTypeScope="" ma:versionID="57c6cd82d3970789675be6d130ff4e66">
   <xsd:schema xmlns:xsd="http://www.w3.org/2001/XMLSchema" xmlns:xs="http://www.w3.org/2001/XMLSchema" xmlns:p="http://schemas.microsoft.com/office/2006/metadata/properties" xmlns:ns1="http://schemas.microsoft.com/sharepoint/v3" xmlns:ns2="8ca203b5-b588-4393-8bee-af94b6d67263" xmlns:ns3="f1a041be-d0ea-4704-81f1-81fc8552e438" targetNamespace="http://schemas.microsoft.com/office/2006/metadata/properties" ma:root="true" ma:fieldsID="49aad76dd0d4cfd8e91c27f6f0b47d56" ns1:_="" ns2:_="" ns3:_="">
     <xsd:import namespace="http://schemas.microsoft.com/sharepoint/v3"/>
@@ -3607,10 +3608,51 @@
 </ct:contentTypeSchema>
 </file>
 
+<file path=customXml/item2.xml><?xml version="1.0" encoding="utf-8"?>
+<p:properties xmlns:p="http://schemas.microsoft.com/office/2006/metadata/properties" xmlns:xsi="http://www.w3.org/2001/XMLSchema-instance" xmlns:pc="http://schemas.microsoft.com/office/infopath/2007/PartnerControls">
+  <documentManagement>
+    <Asignar xmlns="8ca203b5-b588-4393-8bee-af94b6d67263">
+      <UserInfo>
+        <DisplayName/>
+        <AccountId xsi:nil="true"/>
+        <AccountType/>
+      </UserInfo>
+    </Asignar>
+    <TaxCatchAll xmlns="f1a041be-d0ea-4704-81f1-81fc8552e438" xsi:nil="true"/>
+    <lcf76f155ced4ddcb4097134ff3c332f xmlns="8ca203b5-b588-4393-8bee-af94b6d67263">
+      <Terms xmlns="http://schemas.microsoft.com/office/infopath/2007/PartnerControls"/>
+    </lcf76f155ced4ddcb4097134ff3c332f>
+    <_ip_UnifiedCompliancePolicyUIAction xmlns="http://schemas.microsoft.com/sharepoint/v3" xsi:nil="true"/>
+    <_ip_UnifiedCompliancePolicyProperties xmlns="http://schemas.microsoft.com/sharepoint/v3" xsi:nil="true"/>
+  </documentManagement>
+</p:properties>
+</file>
+
+<file path=customXml/item3.xml><?xml version="1.0" encoding="utf-8"?>
+<?mso-contentType ?>
+<FormTemplates xmlns="http://schemas.microsoft.com/sharepoint/v3/contenttype/forms">
+  <Display>DocumentLibraryForm</Display>
+  <Edit>DocumentLibraryForm</Edit>
+  <New>DocumentLibraryForm</New>
+</FormTemplates>
+</file>
+
 <file path=customXml/itemProps1.xml><?xml version="1.0" encoding="utf-8"?>
-<ds:datastoreItem xmlns:ds="http://schemas.openxmlformats.org/officeDocument/2006/customXml" ds:itemID="{A47AE571-3DB6-4CA2-8E67-1A877CB4E1E2}">
+<ds:datastoreItem xmlns:ds="http://schemas.openxmlformats.org/officeDocument/2006/customXml" ds:itemID="{42452084-0BEE-465A-B893-D3D53FB301D7}">
   <ds:schemaRefs>
-    <ds:schemaRef ds:uri="http://schemas.microsoft.com/sharepoint/v3/contenttype/forms"/>
+    <ds:schemaRef ds:uri="http://schemas.microsoft.com/office/2006/metadata/contentType"/>
+    <ds:schemaRef ds:uri="http://schemas.microsoft.com/office/2006/metadata/properties/metaAttributes"/>
+    <ds:schemaRef ds:uri="http://www.w3.org/2001/XMLSchema"/>
+    <ds:schemaRef ds:uri="http://schemas.microsoft.com/office/2006/metadata/properties"/>
+    <ds:schemaRef ds:uri="http://schemas.microsoft.com/sharepoint/v3"/>
+    <ds:schemaRef ds:uri="8ca203b5-b588-4393-8bee-af94b6d67263"/>
+    <ds:schemaRef ds:uri="f1a041be-d0ea-4704-81f1-81fc8552e438"/>
+    <ds:schemaRef ds:uri="http://schemas.microsoft.com/office/2006/documentManagement/types"/>
+    <ds:schemaRef ds:uri="http://schemas.microsoft.com/office/infopath/2007/PartnerControls"/>
+    <ds:schemaRef ds:uri="http://schemas.openxmlformats.org/package/2006/metadata/core-properties"/>
+    <ds:schemaRef ds:uri="http://purl.org/dc/elements/1.1/"/>
+    <ds:schemaRef ds:uri="http://purl.org/dc/terms/"/>
+    <ds:schemaRef ds:uri="http://schemas.microsoft.com/internal/obd"/>
   </ds:schemaRefs>
 </ds:datastoreItem>
 </file>
@@ -3628,21 +3670,9 @@
 </file>
 
 <file path=customXml/itemProps3.xml><?xml version="1.0" encoding="utf-8"?>
-<ds:datastoreItem xmlns:ds="http://schemas.openxmlformats.org/officeDocument/2006/customXml" ds:itemID="{42452084-0BEE-465A-B893-D3D53FB301D7}">
+<ds:datastoreItem xmlns:ds="http://schemas.openxmlformats.org/officeDocument/2006/customXml" ds:itemID="{A47AE571-3DB6-4CA2-8E67-1A877CB4E1E2}">
   <ds:schemaRefs>
-    <ds:schemaRef ds:uri="http://schemas.microsoft.com/office/2006/metadata/contentType"/>
-    <ds:schemaRef ds:uri="http://schemas.microsoft.com/office/2006/metadata/properties/metaAttributes"/>
-    <ds:schemaRef ds:uri="http://www.w3.org/2001/XMLSchema"/>
-    <ds:schemaRef ds:uri="http://schemas.microsoft.com/office/2006/metadata/properties"/>
-    <ds:schemaRef ds:uri="http://schemas.microsoft.com/sharepoint/v3"/>
-    <ds:schemaRef ds:uri="8ca203b5-b588-4393-8bee-af94b6d67263"/>
-    <ds:schemaRef ds:uri="f1a041be-d0ea-4704-81f1-81fc8552e438"/>
-    <ds:schemaRef ds:uri="http://schemas.microsoft.com/office/2006/documentManagement/types"/>
-    <ds:schemaRef ds:uri="http://schemas.microsoft.com/office/infopath/2007/PartnerControls"/>
-    <ds:schemaRef ds:uri="http://schemas.openxmlformats.org/package/2006/metadata/core-properties"/>
-    <ds:schemaRef ds:uri="http://purl.org/dc/elements/1.1/"/>
-    <ds:schemaRef ds:uri="http://purl.org/dc/terms/"/>
-    <ds:schemaRef ds:uri="http://schemas.microsoft.com/internal/obd"/>
+    <ds:schemaRef ds:uri="http://schemas.microsoft.com/sharepoint/v3/contenttype/forms"/>
   </ds:schemaRefs>
 </ds:datastoreItem>
 </file>
</xml_diff>